<commit_message>
Updateded the word file
</commit_message>
<xml_diff>
--- a/prompts.docx
+++ b/prompts.docx
@@ -1,10 +1,194 @@
 
 <file path=word/document.xml><?xml version="1.0" encoding="utf-8"?>
-<w:document xmlns:wpc="http://schemas.microsoft.com/office/word/2010/wordprocessingCanvas" xmlns:cx="http://schemas.microsoft.com/office/drawing/2014/chartex" xmlns:cx1="http://schemas.microsoft.com/office/drawing/2015/9/8/chartex" xmlns:cx2="http://schemas.microsoft.com/office/drawing/2015/10/21/chartex" xmlns:cx3="http://schemas.microsoft.com/office/drawing/2016/5/9/chartex" xmlns:cx4="http://schemas.microsoft.com/office/drawing/2016/5/10/chartex" xmlns:cx5="http://schemas.microsoft.com/office/drawing/2016/5/11/chartex" xmlns:cx6="http://schemas.microsoft.com/office/drawing/2016/5/12/chartex" xmlns:cx7="http://schemas.microsoft.com/office/drawing/2016/5/13/chartex" xmlns:cx8="http://schemas.microsoft.com/office/drawing/2016/5/14/chartex" xmlns:mc="http://schemas.openxmlformats.org/markup-compatibility/2006" xmlns:aink="http://schemas.microsoft.com/office/drawing/2016/ink" xmlns:am3d="http://schemas.microsoft.com/office/drawing/2017/model3d" xmlns:o="urn:schemas-microsoft-com:office:office" xmlns:oel="http://schemas.microsoft.com/office/2019/extlst" xmlns:r="http://schemas.openxmlformats.org/officeDocument/2006/relationships" xmlns:m="http://schemas.openxmlformats.org/officeDocument/2006/math" xmlns:v="urn:schemas-microsoft-com:vml" xmlns:wp14="http://schemas.microsoft.com/office/word/2010/wordprocessingDrawing" xmlns:wp="http://schemas.openxmlformats.org/drawingml/2006/wordprocessingDrawing" xmlns:w10="urn:schemas-microsoft-com:office:word" xmlns:w="http://schemas.openxmlformats.org/wordprocessingml/2006/main" xmlns:w14="http://schemas.microsoft.com/office/word/2010/wordml" xmlns:w15="http://schemas.microsoft.com/office/word/2012/wordml" xmlns:w16cex="http://schemas.microsoft.com/office/word/2018/wordml/cex" xmlns:w16cid="http://schemas.microsoft.com/office/word/2016/wordml/cid" xmlns:w16="http://schemas.microsoft.com/office/word/2018/wordml" xmlns:w16du="http://schemas.microsoft.com/office/word/2023/wordml/word16du" xmlns:w16sdtdh="http://schemas.microsoft.com/office/word/2020/wordml/sdtdatahash" xmlns:w16se="http://schemas.microsoft.com/office/word/2015/wordml/symex" xmlns:wpg="http://schemas.microsoft.com/office/word/2010/wordprocessingGroup" xmlns:wpi="http://schemas.microsoft.com/office/word/2010/wordprocessingInk" xmlns:wne="http://schemas.microsoft.com/office/word/2006/wordml" xmlns:wps="http://schemas.microsoft.com/office/word/2010/wordprocessingShape" mc:Ignorable="w14 w15 w16se w16cid w16 w16cex w16sdtdh w16du wp14">
+<w:document xmlns:wpc="http://schemas.microsoft.com/office/word/2010/wordprocessingCanvas" xmlns:cx="http://schemas.microsoft.com/office/drawing/2014/chartex" xmlns:cx1="http://schemas.microsoft.com/office/drawing/2015/9/8/chartex" xmlns:cx2="http://schemas.microsoft.com/office/drawing/2015/10/21/chartex" xmlns:cx3="http://schemas.microsoft.com/office/drawing/2016/5/9/chartex" xmlns:cx4="http://schemas.microsoft.com/office/drawing/2016/5/10/chartex" xmlns:cx5="http://schemas.microsoft.com/office/drawing/2016/5/11/chartex" xmlns:cx6="http://schemas.microsoft.com/office/drawing/2016/5/12/chartex" xmlns:cx7="http://schemas.microsoft.com/office/drawing/2016/5/13/chartex" xmlns:cx8="http://schemas.microsoft.com/office/drawing/2016/5/14/chartex" xmlns:mc="http://schemas.openxmlformats.org/markup-compatibility/2006" xmlns:aink="http://schemas.microsoft.com/office/drawing/2016/ink" xmlns:am3d="http://schemas.microsoft.com/office/drawing/2017/model3d" xmlns:o="urn:schemas-microsoft-com:office:office" xmlns:oel="http://schemas.microsoft.com/office/2019/extlst" xmlns:r="http://schemas.openxmlformats.org/officeDocument/2006/relationships" xmlns:m="http://schemas.openxmlformats.org/officeDocument/2006/math" xmlns:v="urn:schemas-microsoft-com:vml" xmlns:wp14="http://schemas.microsoft.com/office/word/2010/wordprocessingDrawing" xmlns:wp="http://schemas.openxmlformats.org/drawingml/2006/wordprocessingDrawing" xmlns:w10="urn:schemas-microsoft-com:office:word" xmlns:w="http://schemas.openxmlformats.org/wordprocessingml/2006/main" xmlns:w14="http://schemas.microsoft.com/office/word/2010/wordml" xmlns:w15="http://schemas.microsoft.com/office/word/2012/wordml" xmlns:w16cex="http://schemas.microsoft.com/office/word/2018/wordml/cex" xmlns:w16cid="http://schemas.microsoft.com/office/word/2016/wordml/cid" xmlns:w16="http://schemas.microsoft.com/office/word/2018/wordml" xmlns:w16du="http://schemas.microsoft.com/office/word/2023/wordml/word16du" xmlns:w16sdtdh="http://schemas.microsoft.com/office/word/2020/wordml/sdtdatahash" xmlns:w16sdtfl="http://schemas.microsoft.com/office/word/2024/wordml/sdtformatlock" xmlns:w16se="http://schemas.microsoft.com/office/word/2015/wordml/symex" xmlns:wpg="http://schemas.microsoft.com/office/word/2010/wordprocessingGroup" xmlns:wpi="http://schemas.microsoft.com/office/word/2010/wordprocessingInk" xmlns:wne="http://schemas.microsoft.com/office/word/2006/wordml" xmlns:wps="http://schemas.microsoft.com/office/word/2010/wordprocessingShape" mc:Ignorable="w14 w15 w16se w16cid w16 w16cex w16sdtdh w16sdtfl w16du wp14">
   <w:body>
     <w:p>
-      <w:r>
-        <w:t>make sure to remember the open close status of the menu bar and align the web content  so it aligns when the menu bar opens and closes</w:t>
+      <w:pPr>
+        <w:autoSpaceDE w:val="0"/>
+        <w:autoSpaceDN w:val="0"/>
+        <w:adjustRightInd w:val="0"/>
+        <w:spacing w:after="0" w:line="240" w:lineRule="auto"/>
+        <w:rPr>
+          <w:rFonts w:ascii="AppleSystemUIFont" w:hAnsi="AppleSystemUIFont" w:cs="AppleSystemUIFont"/>
+          <w:kern w:val="0"/>
+          <w:sz w:val="26"/>
+          <w:szCs w:val="26"/>
+          <w:lang w:val="en-GB" w:bidi="ar-SA"/>
+        </w:rPr>
+      </w:pPr>
+      <w:r>
+        <w:rPr>
+          <w:rFonts w:ascii="AppleSystemUIFont" w:hAnsi="AppleSystemUIFont" w:cs="AppleSystemUIFont"/>
+          <w:kern w:val="0"/>
+          <w:sz w:val="26"/>
+          <w:szCs w:val="26"/>
+          <w:lang w:val="en-GB" w:bidi="ar-SA"/>
+        </w:rPr>
+        <w:t>make a website dashboard that includes 4 sections news, student portal, resources &amp; stress release.</w:t>
+      </w:r>
+    </w:p>
+    <w:p>
+      <w:pPr>
+        <w:autoSpaceDE w:val="0"/>
+        <w:autoSpaceDN w:val="0"/>
+        <w:adjustRightInd w:val="0"/>
+        <w:spacing w:after="0" w:line="240" w:lineRule="auto"/>
+        <w:rPr>
+          <w:rFonts w:ascii="AppleSystemUIFont" w:hAnsi="AppleSystemUIFont" w:cs="AppleSystemUIFont"/>
+          <w:kern w:val="0"/>
+          <w:sz w:val="26"/>
+          <w:szCs w:val="26"/>
+          <w:lang w:val="en-GB" w:bidi="ar-SA"/>
+        </w:rPr>
+      </w:pPr>
+    </w:p>
+    <w:p>
+      <w:pPr>
+        <w:autoSpaceDE w:val="0"/>
+        <w:autoSpaceDN w:val="0"/>
+        <w:adjustRightInd w:val="0"/>
+        <w:spacing w:after="0" w:line="240" w:lineRule="auto"/>
+        <w:rPr>
+          <w:rFonts w:ascii="AppleSystemUIFont" w:hAnsi="AppleSystemUIFont" w:cs="AppleSystemUIFont"/>
+          <w:kern w:val="0"/>
+          <w:sz w:val="26"/>
+          <w:szCs w:val="26"/>
+          <w:lang w:val="en-GB" w:bidi="ar-SA"/>
+        </w:rPr>
+      </w:pPr>
+      <w:r>
+        <w:rPr>
+          <w:rFonts w:ascii="AppleSystemUIFont" w:hAnsi="AppleSystemUIFont" w:cs="AppleSystemUIFont"/>
+          <w:kern w:val="0"/>
+          <w:sz w:val="26"/>
+          <w:szCs w:val="26"/>
+          <w:lang w:val="en-GB" w:bidi="ar-SA"/>
+        </w:rPr>
+        <w:t>change the navigation bar into a side bar and make the dashboard items appear in different webpages so in different html files</w:t>
+      </w:r>
+    </w:p>
+    <w:p>
+      <w:pPr>
+        <w:autoSpaceDE w:val="0"/>
+        <w:autoSpaceDN w:val="0"/>
+        <w:adjustRightInd w:val="0"/>
+        <w:spacing w:after="0" w:line="240" w:lineRule="auto"/>
+        <w:rPr>
+          <w:rFonts w:ascii="AppleSystemUIFont" w:hAnsi="AppleSystemUIFont" w:cs="AppleSystemUIFont"/>
+          <w:kern w:val="0"/>
+          <w:sz w:val="26"/>
+          <w:szCs w:val="26"/>
+          <w:lang w:val="en-GB" w:bidi="ar-SA"/>
+        </w:rPr>
+      </w:pPr>
+    </w:p>
+    <w:p>
+      <w:pPr>
+        <w:autoSpaceDE w:val="0"/>
+        <w:autoSpaceDN w:val="0"/>
+        <w:adjustRightInd w:val="0"/>
+        <w:spacing w:after="0" w:line="240" w:lineRule="auto"/>
+        <w:rPr>
+          <w:rFonts w:ascii="AppleSystemUIFont" w:hAnsi="AppleSystemUIFont" w:cs="AppleSystemUIFont"/>
+          <w:kern w:val="0"/>
+          <w:sz w:val="26"/>
+          <w:szCs w:val="26"/>
+          <w:lang w:val="en-GB" w:bidi="ar-SA"/>
+        </w:rPr>
+      </w:pPr>
+      <w:r>
+        <w:rPr>
+          <w:rFonts w:ascii="AppleSystemUIFont" w:hAnsi="AppleSystemUIFont" w:cs="AppleSystemUIFont"/>
+          <w:kern w:val="0"/>
+          <w:sz w:val="26"/>
+          <w:szCs w:val="26"/>
+          <w:lang w:val="en-GB" w:bidi="ar-SA"/>
+        </w:rPr>
+        <w:t xml:space="preserve">add a menu button to show and hide the side bar </w:t>
+      </w:r>
+      <w:proofErr w:type="gramStart"/>
+      <w:r>
+        <w:rPr>
+          <w:rFonts w:ascii="AppleSystemUIFont" w:hAnsi="AppleSystemUIFont" w:cs="AppleSystemUIFont"/>
+          <w:kern w:val="0"/>
+          <w:sz w:val="26"/>
+          <w:szCs w:val="26"/>
+          <w:lang w:val="en-GB" w:bidi="ar-SA"/>
+        </w:rPr>
+        <w:t>and also</w:t>
+      </w:r>
+      <w:proofErr w:type="gramEnd"/>
+      <w:r>
+        <w:rPr>
+          <w:rFonts w:ascii="AppleSystemUIFont" w:hAnsi="AppleSystemUIFont" w:cs="AppleSystemUIFont"/>
+          <w:kern w:val="0"/>
+          <w:sz w:val="26"/>
+          <w:szCs w:val="26"/>
+          <w:lang w:val="en-GB" w:bidi="ar-SA"/>
+        </w:rPr>
+        <w:t xml:space="preserve"> add links to the dashboard items to the home page</w:t>
+      </w:r>
+    </w:p>
+    <w:p>
+      <w:pPr>
+        <w:autoSpaceDE w:val="0"/>
+        <w:autoSpaceDN w:val="0"/>
+        <w:adjustRightInd w:val="0"/>
+        <w:spacing w:after="0" w:line="240" w:lineRule="auto"/>
+        <w:rPr>
+          <w:rFonts w:ascii="AppleSystemUIFont" w:hAnsi="AppleSystemUIFont" w:cs="AppleSystemUIFont"/>
+          <w:kern w:val="0"/>
+          <w:sz w:val="26"/>
+          <w:szCs w:val="26"/>
+          <w:lang w:val="en-GB" w:bidi="ar-SA"/>
+        </w:rPr>
+      </w:pPr>
+    </w:p>
+    <w:p>
+      <w:r>
+        <w:rPr>
+          <w:rFonts w:ascii="AppleSystemUIFont" w:hAnsi="AppleSystemUIFont" w:cs="AppleSystemUIFont"/>
+          <w:kern w:val="0"/>
+          <w:sz w:val="26"/>
+          <w:szCs w:val="26"/>
+          <w:lang w:val="en-GB" w:bidi="ar-SA"/>
+        </w:rPr>
+        <w:t xml:space="preserve">make sure the menu button is </w:t>
+      </w:r>
+      <w:proofErr w:type="spellStart"/>
+      <w:r>
+        <w:rPr>
+          <w:rFonts w:ascii="AppleSystemUIFont" w:hAnsi="AppleSystemUIFont" w:cs="AppleSystemUIFont"/>
+          <w:kern w:val="0"/>
+          <w:sz w:val="26"/>
+          <w:szCs w:val="26"/>
+          <w:lang w:val="en-GB" w:bidi="ar-SA"/>
+        </w:rPr>
+        <w:t>consistant</w:t>
+      </w:r>
+      <w:proofErr w:type="spellEnd"/>
+      <w:r>
+        <w:rPr>
+          <w:rFonts w:ascii="AppleSystemUIFont" w:hAnsi="AppleSystemUIFont" w:cs="AppleSystemUIFont"/>
+          <w:kern w:val="0"/>
+          <w:sz w:val="26"/>
+          <w:szCs w:val="26"/>
+          <w:lang w:val="en-GB" w:bidi="ar-SA"/>
+        </w:rPr>
+        <w:t xml:space="preserve"> throughout the webpage and align the content to the middle and adjust it when the menu opens and closes</w:t>
+      </w:r>
+    </w:p>
+    <w:p>
+      <w:r>
+        <w:t xml:space="preserve">make sure to remember the open close status of the menu bar and align the web </w:t>
+      </w:r>
+      <w:proofErr w:type="gramStart"/>
+      <w:r>
+        <w:t>content  so</w:t>
+      </w:r>
+      <w:proofErr w:type="gramEnd"/>
+      <w:r>
+        <w:t xml:space="preserve"> it aligns when the menu bar opens and closes</w:t>
       </w:r>
     </w:p>
     <w:p/>
@@ -55,7 +239,7 @@
 </file>
 
 <file path=word/styles.xml><?xml version="1.0" encoding="utf-8"?>
-<w:styles xmlns:mc="http://schemas.openxmlformats.org/markup-compatibility/2006" xmlns:r="http://schemas.openxmlformats.org/officeDocument/2006/relationships" xmlns:w="http://schemas.openxmlformats.org/wordprocessingml/2006/main" xmlns:w14="http://schemas.microsoft.com/office/word/2010/wordml" xmlns:w15="http://schemas.microsoft.com/office/word/2012/wordml" xmlns:w16cex="http://schemas.microsoft.com/office/word/2018/wordml/cex" xmlns:w16cid="http://schemas.microsoft.com/office/word/2016/wordml/cid" xmlns:w16="http://schemas.microsoft.com/office/word/2018/wordml" xmlns:w16du="http://schemas.microsoft.com/office/word/2023/wordml/word16du" xmlns:w16sdtdh="http://schemas.microsoft.com/office/word/2020/wordml/sdtdatahash" xmlns:w16se="http://schemas.microsoft.com/office/word/2015/wordml/symex" mc:Ignorable="w14 w15 w16se w16cid w16 w16cex w16sdtdh w16du">
+<w:styles xmlns:mc="http://schemas.openxmlformats.org/markup-compatibility/2006" xmlns:r="http://schemas.openxmlformats.org/officeDocument/2006/relationships" xmlns:w="http://schemas.openxmlformats.org/wordprocessingml/2006/main" xmlns:w14="http://schemas.microsoft.com/office/word/2010/wordml" xmlns:w15="http://schemas.microsoft.com/office/word/2012/wordml" xmlns:w16cex="http://schemas.microsoft.com/office/word/2018/wordml/cex" xmlns:w16cid="http://schemas.microsoft.com/office/word/2016/wordml/cid" xmlns:w16="http://schemas.microsoft.com/office/word/2018/wordml" xmlns:w16du="http://schemas.microsoft.com/office/word/2023/wordml/word16du" xmlns:w16sdtdh="http://schemas.microsoft.com/office/word/2020/wordml/sdtdatahash" xmlns:w16sdtfl="http://schemas.microsoft.com/office/word/2024/wordml/sdtformatlock" xmlns:w16se="http://schemas.microsoft.com/office/word/2015/wordml/symex" mc:Ignorable="w14 w15 w16se w16cid w16 w16cex w16sdtdh w16sdtfl w16du">
   <w:docDefaults>
     <w:rPrDefault>
       <w:rPr>

</xml_diff>